<commit_message>
Highlight AMFG MCP and CI improvements
- Add MCP to the AMFG technology stack
- Document the 5x CI test-time reduction and public MCP/API integration
- Update software engineer CV downloads
</commit_message>
<xml_diff>
--- a/public/CV_Alex_Kostyniuk_Software_Engineer.docx
+++ b/public/CV_Alex_Kostyniuk_Software_Engineer.docx
@@ -164,6 +164,18 @@
         </w:numPr>
       </w:pPr>
       <w:r>
+        <w:t xml:space="preserve">Cut CI test time 5x, from 20 min to 4, by optimizing how tests work with the database.</w:t>
+      </w:r>
+    </w:p>
+    <w:p>
+      <w:pPr>
+        <w:pStyle w:val="AtsBullet"/>
+        <w:numPr>
+          <w:ilvl w:val="0"/>
+          <w:numId w:val="2"/>
+        </w:numPr>
+      </w:pPr>
+      <w:r>
         <w:t xml:space="preserve">Leading architecture and delivery across frontend modernization, backend platform work, performance improvements, and team-wide developer experience initiatives while managing a team of 3 engineers.</w:t>
       </w:r>
     </w:p>
@@ -193,6 +205,18 @@
     </w:p>
     <w:p>
       <w:pPr>
+        <w:pStyle w:val="AtsBullet"/>
+        <w:numPr>
+          <w:ilvl w:val="0"/>
+          <w:numId w:val="2"/>
+        </w:numPr>
+      </w:pPr>
+      <w:r>
+        <w:t xml:space="preserve">Implemented MCP/Public API for users to be able to do actions outside of AMFG application</w:t>
+      </w:r>
+    </w:p>
+    <w:p>
+      <w:pPr>
         <w:pStyle w:val="AtsEntryTitle"/>
       </w:pPr>
       <w:r>
@@ -461,7 +485,7 @@
         </w:numPr>
       </w:pPr>
       <w:r>
-        <w:t xml:space="preserve">Frontend: React, all Tanstack, Next.js, Tailwind CSS, shadcn/ui</w:t>
+        <w:t xml:space="preserve">Frontend: React, all TanStack, Next.js, Tailwind CSS, shadcn/ui</w:t>
       </w:r>
     </w:p>
     <w:p>
@@ -485,7 +509,7 @@
         </w:numPr>
       </w:pPr>
       <w:r>
-        <w:t xml:space="preserve">Tooling: oxc</w:t>
+        <w:t xml:space="preserve">Tooling: oxc, Vite, Vitest</w:t>
       </w:r>
     </w:p>
     <w:p>

</xml_diff>